<commit_message>
feat(site): publish latest portfolio experience
</commit_message>
<xml_diff>
--- a/assets/Truong-Dinh-Anh-Tu-CV-2026.docx
+++ b/assets/Truong-Dinh-Anh-Tu-CV-2026.docx
@@ -10,10 +10,11 @@
       </w:pPr>
       <w:r>
         <w:rPr>
-          <w:rFonts w:ascii="Arial" w:hAnsi="Arial"/>
+          <w:rFonts w:ascii="Arial" w:hAnsi="Arial" w:eastAsia="Arial"/>
           <w:b/>
           <w:color w:val="143D59"/>
           <w:sz w:val="46"/>
+          <w:u w:val="none"/>
         </w:rPr>
         <w:t>TRUONG DINH ANH TU</w:t>
       </w:r>
@@ -28,12 +29,11 @@
         <w:rPr>
           <w:rFonts w:ascii="Arial" w:hAnsi="Arial" w:eastAsia="Arial"/>
           <w:b w:val="0"/>
-          <w:i w:val="0"/>
           <w:color w:val="545B64"/>
           <w:sz w:val="21"/>
           <w:u w:val="none"/>
         </w:rPr>
-        <w:t>FP&amp;A Analyst | Finance Analytics | Python Automation | BI Automation</w:t>
+        <w:t>FP&amp;A Analyst | MNC Finance Analytics | Python &amp; BI Automation</w:t>
       </w:r>
     </w:p>
     <w:p>
@@ -47,24 +47,26 @@
       </w:pPr>
       <w:r>
         <w:rPr>
-          <w:rFonts w:ascii="Arial" w:hAnsi="Arial"/>
+          <w:rFonts w:ascii="Arial" w:hAnsi="Arial" w:eastAsia="Arial"/>
           <w:color w:val="545B64"/>
           <w:sz w:val="18"/>
+          <w:u w:val="none"/>
         </w:rPr>
-        <w:t>Ho Chi Minh City, Vietnam</w:t>
+        <w:t>HCMC, Vietnam</w:t>
       </w:r>
       <w:r>
         <w:rPr>
-          <w:rFonts w:ascii="Arial" w:hAnsi="Arial"/>
+          <w:rFonts w:ascii="Arial" w:hAnsi="Arial" w:eastAsia="Arial"/>
           <w:color w:val="545B64"/>
           <w:sz w:val="18"/>
+          <w:u w:val="none"/>
         </w:rPr>
         <w:t xml:space="preserve"> | </w:t>
       </w:r>
       <w:hyperlink r:id="rId9">
         <w:r>
           <w:rPr>
-            <w:rFonts w:ascii="Arial" w:hAnsi="Arial"/>
+            <w:rFonts w:ascii="Arial" w:hAnsi="Arial" w:eastAsia="Arial" w:cs="Arial"/>
             <w:sz w:val="18"/>
             <w:color w:val="1F5F8B"/>
             <w:u w:val="none"/>
@@ -74,16 +76,17 @@
       </w:hyperlink>
       <w:r>
         <w:rPr>
-          <w:rFonts w:ascii="Arial" w:hAnsi="Arial"/>
+          <w:rFonts w:ascii="Arial" w:hAnsi="Arial" w:eastAsia="Arial"/>
           <w:color w:val="545B64"/>
           <w:sz w:val="18"/>
+          <w:u w:val="none"/>
         </w:rPr>
         <w:t xml:space="preserve"> | </w:t>
       </w:r>
       <w:hyperlink r:id="rId10">
         <w:r>
           <w:rPr>
-            <w:rFonts w:ascii="Arial" w:hAnsi="Arial"/>
+            <w:rFonts w:ascii="Arial" w:hAnsi="Arial" w:eastAsia="Arial" w:cs="Arial"/>
             <w:sz w:val="18"/>
             <w:color w:val="1F5F8B"/>
             <w:u w:val="none"/>
@@ -93,16 +96,17 @@
       </w:hyperlink>
       <w:r>
         <w:rPr>
-          <w:rFonts w:ascii="Arial" w:hAnsi="Arial"/>
+          <w:rFonts w:ascii="Arial" w:hAnsi="Arial" w:eastAsia="Arial"/>
           <w:color w:val="545B64"/>
           <w:sz w:val="18"/>
+          <w:u w:val="none"/>
         </w:rPr>
         <w:t xml:space="preserve"> | </w:t>
       </w:r>
       <w:hyperlink r:id="rId11">
         <w:r>
           <w:rPr>
-            <w:rFonts w:ascii="Arial" w:hAnsi="Arial"/>
+            <w:rFonts w:ascii="Arial" w:hAnsi="Arial" w:eastAsia="Arial" w:cs="Arial"/>
             <w:sz w:val="18"/>
             <w:color w:val="1F5F8B"/>
             <w:u w:val="none"/>
@@ -112,16 +116,17 @@
       </w:hyperlink>
       <w:r>
         <w:rPr>
-          <w:rFonts w:ascii="Arial" w:hAnsi="Arial"/>
+          <w:rFonts w:ascii="Arial" w:hAnsi="Arial" w:eastAsia="Arial"/>
           <w:color w:val="545B64"/>
           <w:sz w:val="18"/>
+          <w:u w:val="none"/>
         </w:rPr>
         <w:t xml:space="preserve"> | </w:t>
       </w:r>
       <w:hyperlink r:id="rId12">
         <w:r>
           <w:rPr>
-            <w:rFonts w:ascii="Arial" w:hAnsi="Arial"/>
+            <w:rFonts w:ascii="Arial" w:hAnsi="Arial" w:eastAsia="Arial" w:cs="Arial"/>
             <w:sz w:val="18"/>
             <w:color w:val="1F5F8B"/>
             <w:u w:val="none"/>
@@ -131,16 +136,17 @@
       </w:hyperlink>
       <w:r>
         <w:rPr>
-          <w:rFonts w:ascii="Arial" w:hAnsi="Arial"/>
+          <w:rFonts w:ascii="Arial" w:hAnsi="Arial" w:eastAsia="Arial"/>
           <w:color w:val="545B64"/>
           <w:sz w:val="18"/>
+          <w:u w:val="none"/>
         </w:rPr>
         <w:t xml:space="preserve"> | </w:t>
       </w:r>
       <w:hyperlink r:id="rId13">
         <w:r>
           <w:rPr>
-            <w:rFonts w:ascii="Arial" w:hAnsi="Arial"/>
+            <w:rFonts w:ascii="Arial" w:hAnsi="Arial" w:eastAsia="Arial" w:cs="Arial"/>
             <w:sz w:val="18"/>
             <w:color w:val="1F5F8B"/>
             <w:u w:val="none"/>
@@ -152,7 +158,7 @@
     <w:p>
       <w:pPr>
         <w:keepNext/>
-        <w:spacing w:before="140" w:after="120" w:line="240" w:lineRule="auto"/>
+        <w:spacing w:before="150" w:after="130" w:line="240" w:lineRule="auto"/>
         <w:pBdr>
           <w:bottom w:val="single" w:sz="6" w:space="4" w:color="D6DEE6"/>
         </w:pBdr>
@@ -173,7 +179,7 @@
     <w:p>
       <w:pPr>
         <w:keepNext w:val="0"/>
-        <w:spacing w:before="0" w:after="60" w:line="269" w:lineRule="auto"/>
+        <w:spacing w:before="0" w:after="64" w:line="278" w:lineRule="auto"/>
         <w:jc w:val="both"/>
       </w:pPr>
       <w:r>
@@ -185,13 +191,13 @@
           <w:sz w:val="18"/>
           <w:u w:val="none"/>
         </w:rPr>
-        <w:t>FP&amp;A analyst with hands-on experience in budgeting, management reporting, KPI governance, commercial analysis, audit support, and BI/Python automation. I turn recurring finance workflows into controlled reporting pipelines, dashboard-ready datasets, variance insights, and agent-assisted review logic while keeping reconciliations and human approval points visible.</w:t>
+        <w:t>FP&amp;A analyst with hands-on experience in budgeting, management reporting, KPI governance, commercial analysis, audit support, and BI/Python automation across finance operations. I build controlled reporting pipelines, dashboard-ready datasets, variance insights, and agent-assisted review logic, with exposure to English-speaking MNC workflows and multi-entity finance reporting.</w:t>
       </w:r>
     </w:p>
     <w:p>
       <w:pPr>
         <w:keepNext/>
-        <w:spacing w:before="140" w:after="120" w:line="240" w:lineRule="auto"/>
+        <w:spacing w:before="150" w:after="130" w:line="240" w:lineRule="auto"/>
         <w:pBdr>
           <w:bottom w:val="single" w:sz="6" w:space="4" w:color="D6DEE6"/>
         </w:pBdr>
@@ -211,8 +217,9 @@
     </w:p>
     <w:tbl>
       <w:tblPr>
-        <w:tblW w:type="dxa" w:w="9360"/>
+        <w:tblW w:type="dxa" w:w="9864"/>
         <w:jc w:val="left"/>
+        <w:tblLayout w:type="fixed"/>
         <w:tblLook w:firstColumn="1" w:firstRow="1" w:lastColumn="0" w:lastRow="0" w:noHBand="0" w:noVBand="1" w:val="04A0"/>
         <w:tblBorders>
           <w:top w:val="nil"/>
@@ -224,14 +231,14 @@
         </w:tblBorders>
       </w:tblPr>
       <w:tblGrid>
-        <w:gridCol w:w="3297"/>
-        <w:gridCol w:w="3297"/>
-        <w:gridCol w:w="3297"/>
+        <w:gridCol w:w="6552"/>
+        <w:gridCol w:w="2088"/>
+        <w:gridCol w:w="1224"/>
       </w:tblGrid>
       <w:tr>
         <w:tc>
           <w:tcPr>
-            <w:tcW w:type="dxa" w:w="5200"/>
+            <w:tcW w:type="dxa" w:w="6552"/>
             <w:tcMar>
               <w:top w:w="75" w:type="dxa"/>
               <w:start w:w="70" w:type="dxa"/>
@@ -243,7 +250,8 @@
           <w:p>
             <w:pPr>
               <w:keepNext w:val="0"/>
-              <w:spacing w:before="0" w:after="16" w:line="252" w:lineRule="auto"/>
+              <w:spacing w:before="0" w:after="44" w:line="269" w:lineRule="auto"/>
+              <w:jc w:val="left"/>
             </w:pPr>
             <w:r>
               <w:rPr>
@@ -259,7 +267,7 @@
             <w:hyperlink r:id="rId14">
               <w:r>
                 <w:rPr>
-                  <w:rFonts w:ascii="Arial" w:hAnsi="Arial"/>
+                  <w:rFonts w:ascii="Arial" w:hAnsi="Arial" w:eastAsia="Arial" w:cs="Arial"/>
                   <w:sz w:val="21"/>
                   <w:color w:val="005BA0"/>
                   <w:u w:val="none"/>
@@ -271,7 +279,7 @@
         </w:tc>
         <w:tc>
           <w:tcPr>
-            <w:tcW w:type="dxa" w:w="2050"/>
+            <w:tcW w:type="dxa" w:w="2088"/>
             <w:tcMar>
               <w:top w:w="75" w:type="dxa"/>
               <w:start w:w="70" w:type="dxa"/>
@@ -283,7 +291,7 @@
           <w:p>
             <w:pPr>
               <w:keepNext w:val="0"/>
-              <w:spacing w:before="0" w:after="16" w:line="252" w:lineRule="auto"/>
+              <w:spacing w:before="0" w:after="44" w:line="269" w:lineRule="auto"/>
               <w:jc w:val="right"/>
             </w:pPr>
             <w:r>
@@ -295,13 +303,13 @@
                 <w:sz w:val="17"/>
                 <w:u w:val="none"/>
               </w:rPr>
-              <w:t>Sep 2025 - Present</w:t>
+              <w:t>Sep 2025 - Jun 2026</w:t>
             </w:r>
           </w:p>
         </w:tc>
         <w:tc>
           <w:tcPr>
-            <w:tcW w:type="dxa" w:w="2110"/>
+            <w:tcW w:type="dxa" w:w="1224"/>
             <w:tcMar>
               <w:top w:w="75" w:type="dxa"/>
               <w:start w:w="70" w:type="dxa"/>
@@ -313,7 +321,7 @@
           <w:p>
             <w:pPr>
               <w:keepNext w:val="0"/>
-              <w:spacing w:before="0" w:after="16" w:line="252" w:lineRule="auto"/>
+              <w:spacing w:before="0" w:after="44" w:line="269" w:lineRule="auto"/>
               <w:jc w:val="right"/>
             </w:pPr>
             <w:r>
@@ -325,7 +333,7 @@
                 <w:sz w:val="17"/>
                 <w:u w:val="none"/>
               </w:rPr>
-              <w:t>Ho Chi Minh City, VN</w:t>
+              <w:t>HCMC, VN</w:t>
             </w:r>
           </w:p>
         </w:tc>
@@ -334,7 +342,7 @@
     <w:p>
       <w:pPr>
         <w:keepNext/>
-        <w:spacing w:before="60" w:after="44" w:line="240" w:lineRule="auto"/>
+        <w:spacing w:before="64" w:after="48" w:line="240" w:lineRule="auto"/>
         <w:jc w:val="left"/>
       </w:pPr>
       <w:r>
@@ -353,7 +361,7 @@
       <w:pPr>
         <w:pStyle w:val="ListBullet"/>
         <w:keepNext w:val="0"/>
-        <w:spacing w:before="0" w:after="60" w:line="271" w:lineRule="auto"/>
+        <w:spacing w:before="0" w:after="76" w:line="288" w:lineRule="auto"/>
         <w:ind w:left="518" w:hanging="259"/>
         <w:jc w:val="both"/>
       </w:pPr>
@@ -366,14 +374,14 @@
           <w:sz w:val="18"/>
           <w:u w:val="none"/>
         </w:rPr>
-        <w:t>Supported 2026 annual budgeting for BEEHCM; updated P&amp;L/budget actuals and built target allocation views for BEEHCM, Binh Duong, Dong Nai, Can Tho/Mekong, AOG, and GGA.</w:t>
+        <w:t>Supported 2026 annual budgeting for BEEHCM; updated P&amp;L/budget actuals and built target allocation views for BEEHCM, five subsidiaries, and one associate company.</w:t>
       </w:r>
     </w:p>
     <w:p>
       <w:pPr>
         <w:pStyle w:val="ListBullet"/>
         <w:keepNext w:val="0"/>
-        <w:spacing w:before="0" w:after="60" w:line="271" w:lineRule="auto"/>
+        <w:spacing w:before="0" w:after="76" w:line="288" w:lineRule="auto"/>
         <w:ind w:left="518" w:hanging="259"/>
         <w:jc w:val="both"/>
       </w:pPr>
@@ -393,7 +401,7 @@
       <w:pPr>
         <w:pStyle w:val="ListBullet"/>
         <w:keepNext w:val="0"/>
-        <w:spacing w:before="0" w:after="60" w:line="271" w:lineRule="auto"/>
+        <w:spacing w:before="0" w:after="76" w:line="288" w:lineRule="auto"/>
         <w:ind w:left="518" w:hanging="259"/>
         <w:jc w:val="both"/>
       </w:pPr>
@@ -412,7 +420,7 @@
     <w:p>
       <w:pPr>
         <w:keepNext/>
-        <w:spacing w:before="60" w:after="44" w:line="240" w:lineRule="auto"/>
+        <w:spacing w:before="64" w:after="48" w:line="240" w:lineRule="auto"/>
         <w:jc w:val="left"/>
       </w:pPr>
       <w:r>
@@ -431,7 +439,7 @@
       <w:pPr>
         <w:pStyle w:val="ListBullet"/>
         <w:keepNext w:val="0"/>
-        <w:spacing w:before="0" w:after="60" w:line="271" w:lineRule="auto"/>
+        <w:spacing w:before="0" w:after="76" w:line="288" w:lineRule="auto"/>
         <w:ind w:left="518" w:hanging="259"/>
         <w:jc w:val="both"/>
       </w:pPr>
@@ -451,7 +459,7 @@
       <w:pPr>
         <w:pStyle w:val="ListBullet"/>
         <w:keepNext w:val="0"/>
-        <w:spacing w:before="0" w:after="60" w:line="271" w:lineRule="auto"/>
+        <w:spacing w:before="0" w:after="76" w:line="288" w:lineRule="auto"/>
         <w:ind w:left="518" w:hanging="259"/>
         <w:jc w:val="both"/>
       </w:pPr>
@@ -471,7 +479,7 @@
       <w:pPr>
         <w:pStyle w:val="ListBullet"/>
         <w:keepNext w:val="0"/>
-        <w:spacing w:before="0" w:after="60" w:line="271" w:lineRule="auto"/>
+        <w:spacing w:before="0" w:after="76" w:line="288" w:lineRule="auto"/>
         <w:ind w:left="518" w:hanging="259"/>
         <w:jc w:val="both"/>
       </w:pPr>
@@ -490,7 +498,7 @@
     <w:p>
       <w:pPr>
         <w:keepNext/>
-        <w:spacing w:before="60" w:after="44" w:line="240" w:lineRule="auto"/>
+        <w:spacing w:before="64" w:after="48" w:line="240" w:lineRule="auto"/>
         <w:jc w:val="left"/>
       </w:pPr>
       <w:r>
@@ -509,7 +517,7 @@
       <w:pPr>
         <w:pStyle w:val="ListBullet"/>
         <w:keepNext w:val="0"/>
-        <w:spacing w:before="0" w:after="60" w:line="271" w:lineRule="auto"/>
+        <w:spacing w:before="0" w:after="76" w:line="288" w:lineRule="auto"/>
         <w:ind w:left="518" w:hanging="259"/>
         <w:jc w:val="both"/>
       </w:pPr>
@@ -529,7 +537,7 @@
       <w:pPr>
         <w:pStyle w:val="ListBullet"/>
         <w:keepNext w:val="0"/>
-        <w:spacing w:before="0" w:after="60" w:line="271" w:lineRule="auto"/>
+        <w:spacing w:before="0" w:after="76" w:line="288" w:lineRule="auto"/>
         <w:ind w:left="518" w:hanging="259"/>
         <w:jc w:val="both"/>
       </w:pPr>
@@ -549,7 +557,7 @@
       <w:pPr>
         <w:pStyle w:val="ListBullet"/>
         <w:keepNext w:val="0"/>
-        <w:spacing w:before="0" w:after="60" w:line="271" w:lineRule="auto"/>
+        <w:spacing w:before="0" w:after="76" w:line="288" w:lineRule="auto"/>
         <w:ind w:left="518" w:hanging="259"/>
         <w:jc w:val="both"/>
       </w:pPr>
@@ -568,7 +576,7 @@
     <w:p>
       <w:pPr>
         <w:keepNext/>
-        <w:spacing w:before="60" w:after="44" w:line="240" w:lineRule="auto"/>
+        <w:spacing w:before="64" w:after="48" w:line="240" w:lineRule="auto"/>
         <w:jc w:val="left"/>
       </w:pPr>
       <w:r>
@@ -587,7 +595,7 @@
       <w:pPr>
         <w:pStyle w:val="ListBullet"/>
         <w:keepNext w:val="0"/>
-        <w:spacing w:before="0" w:after="60" w:line="271" w:lineRule="auto"/>
+        <w:spacing w:before="0" w:after="76" w:line="288" w:lineRule="auto"/>
         <w:ind w:left="518" w:hanging="259"/>
         <w:jc w:val="both"/>
       </w:pPr>
@@ -607,7 +615,7 @@
       <w:pPr>
         <w:pStyle w:val="ListBullet"/>
         <w:keepNext w:val="0"/>
-        <w:spacing w:before="0" w:after="60" w:line="271" w:lineRule="auto"/>
+        <w:spacing w:before="0" w:after="76" w:line="288" w:lineRule="auto"/>
         <w:ind w:left="518" w:hanging="259"/>
         <w:jc w:val="both"/>
       </w:pPr>
@@ -626,7 +634,7 @@
     <w:p>
       <w:pPr>
         <w:keepNext/>
-        <w:spacing w:before="60" w:after="44" w:line="240" w:lineRule="auto"/>
+        <w:spacing w:before="64" w:after="48" w:line="240" w:lineRule="auto"/>
         <w:jc w:val="left"/>
       </w:pPr>
       <w:r>
@@ -645,7 +653,7 @@
       <w:pPr>
         <w:pStyle w:val="ListBullet"/>
         <w:keepNext w:val="0"/>
-        <w:spacing w:before="0" w:after="60" w:line="271" w:lineRule="auto"/>
+        <w:spacing w:before="0" w:after="76" w:line="288" w:lineRule="auto"/>
         <w:ind w:left="518" w:hanging="259"/>
         <w:jc w:val="both"/>
       </w:pPr>
@@ -665,7 +673,7 @@
       <w:pPr>
         <w:pStyle w:val="ListBullet"/>
         <w:keepNext w:val="0"/>
-        <w:spacing w:before="0" w:after="60" w:line="271" w:lineRule="auto"/>
+        <w:spacing w:before="0" w:after="76" w:line="288" w:lineRule="auto"/>
         <w:ind w:left="518" w:hanging="259"/>
         <w:jc w:val="both"/>
       </w:pPr>
@@ -684,7 +692,7 @@
     <w:p>
       <w:pPr>
         <w:keepNext/>
-        <w:spacing w:before="60" w:after="44" w:line="240" w:lineRule="auto"/>
+        <w:spacing w:before="64" w:after="48" w:line="240" w:lineRule="auto"/>
         <w:jc w:val="left"/>
       </w:pPr>
       <w:r>
@@ -702,7 +710,7 @@
       <w:pPr>
         <w:pStyle w:val="ListBullet"/>
         <w:keepNext w:val="0"/>
-        <w:spacing w:before="0" w:after="60" w:line="271" w:lineRule="auto"/>
+        <w:spacing w:before="0" w:after="76" w:line="288" w:lineRule="auto"/>
         <w:ind w:left="518" w:hanging="259"/>
         <w:jc w:val="both"/>
       </w:pPr>
@@ -722,7 +730,7 @@
       <w:pPr>
         <w:pStyle w:val="ListBullet"/>
         <w:keepNext w:val="0"/>
-        <w:spacing w:before="0" w:after="60" w:line="271" w:lineRule="auto"/>
+        <w:spacing w:before="0" w:after="76" w:line="288" w:lineRule="auto"/>
         <w:ind w:left="518" w:hanging="259"/>
         <w:jc w:val="both"/>
       </w:pPr>
@@ -742,7 +750,7 @@
       <w:pPr>
         <w:pStyle w:val="ListBullet"/>
         <w:keepNext w:val="0"/>
-        <w:spacing w:before="0" w:after="60" w:line="271" w:lineRule="auto"/>
+        <w:spacing w:before="0" w:after="76" w:line="288" w:lineRule="auto"/>
         <w:ind w:left="518" w:hanging="259"/>
         <w:jc w:val="both"/>
       </w:pPr>
@@ -765,8 +773,9 @@
     </w:p>
     <w:tbl>
       <w:tblPr>
-        <w:tblW w:type="dxa" w:w="9360"/>
+        <w:tblW w:type="dxa" w:w="9864"/>
         <w:jc w:val="left"/>
+        <w:tblLayout w:type="fixed"/>
         <w:tblLook w:firstColumn="1" w:firstRow="1" w:lastColumn="0" w:lastRow="0" w:noHBand="0" w:noVBand="1" w:val="04A0"/>
         <w:tblBorders>
           <w:top w:val="nil"/>
@@ -778,14 +787,14 @@
         </w:tblBorders>
       </w:tblPr>
       <w:tblGrid>
-        <w:gridCol w:w="3297"/>
-        <w:gridCol w:w="3297"/>
-        <w:gridCol w:w="3297"/>
+        <w:gridCol w:w="6552"/>
+        <w:gridCol w:w="2088"/>
+        <w:gridCol w:w="1224"/>
       </w:tblGrid>
       <w:tr>
         <w:tc>
           <w:tcPr>
-            <w:tcW w:type="dxa" w:w="5200"/>
+            <w:tcW w:type="dxa" w:w="6552"/>
             <w:tcMar>
               <w:top w:w="75" w:type="dxa"/>
               <w:start w:w="70" w:type="dxa"/>
@@ -797,7 +806,8 @@
           <w:p>
             <w:pPr>
               <w:keepNext w:val="0"/>
-              <w:spacing w:before="0" w:after="16" w:line="252" w:lineRule="auto"/>
+              <w:spacing w:before="0" w:after="44" w:line="269" w:lineRule="auto"/>
+              <w:jc w:val="left"/>
             </w:pPr>
             <w:r>
               <w:rPr>
@@ -813,7 +823,7 @@
             <w:hyperlink r:id="rId15">
               <w:r>
                 <w:rPr>
-                  <w:rFonts w:ascii="Arial" w:hAnsi="Arial"/>
+                  <w:rFonts w:ascii="Arial" w:hAnsi="Arial" w:eastAsia="Arial" w:cs="Arial"/>
                   <w:sz w:val="21"/>
                   <w:color w:val="005BA0"/>
                   <w:u w:val="none"/>
@@ -825,7 +835,7 @@
         </w:tc>
         <w:tc>
           <w:tcPr>
-            <w:tcW w:type="dxa" w:w="2050"/>
+            <w:tcW w:type="dxa" w:w="2088"/>
             <w:tcMar>
               <w:top w:w="75" w:type="dxa"/>
               <w:start w:w="70" w:type="dxa"/>
@@ -837,7 +847,7 @@
           <w:p>
             <w:pPr>
               <w:keepNext w:val="0"/>
-              <w:spacing w:before="0" w:after="16" w:line="252" w:lineRule="auto"/>
+              <w:spacing w:before="0" w:after="44" w:line="269" w:lineRule="auto"/>
               <w:jc w:val="right"/>
             </w:pPr>
             <w:r>
@@ -855,7 +865,7 @@
         </w:tc>
         <w:tc>
           <w:tcPr>
-            <w:tcW w:type="dxa" w:w="2110"/>
+            <w:tcW w:type="dxa" w:w="1224"/>
             <w:tcMar>
               <w:top w:w="75" w:type="dxa"/>
               <w:start w:w="70" w:type="dxa"/>
@@ -867,7 +877,7 @@
           <w:p>
             <w:pPr>
               <w:keepNext w:val="0"/>
-              <w:spacing w:before="0" w:after="16" w:line="252" w:lineRule="auto"/>
+              <w:spacing w:before="0" w:after="44" w:line="269" w:lineRule="auto"/>
               <w:jc w:val="right"/>
             </w:pPr>
             <w:r>
@@ -879,7 +889,7 @@
                 <w:sz w:val="17"/>
                 <w:u w:val="none"/>
               </w:rPr>
-              <w:t>Ho Chi Minh City, VN</w:t>
+              <w:t>HCMC, VN</w:t>
             </w:r>
           </w:p>
         </w:tc>
@@ -889,7 +899,7 @@
       <w:pPr>
         <w:pStyle w:val="ListBullet"/>
         <w:keepNext w:val="0"/>
-        <w:spacing w:before="0" w:after="60" w:line="271" w:lineRule="auto"/>
+        <w:spacing w:before="0" w:after="76" w:line="288" w:lineRule="auto"/>
         <w:ind w:left="518" w:hanging="259"/>
         <w:jc w:val="both"/>
       </w:pPr>
@@ -909,7 +919,7 @@
       <w:pPr>
         <w:pStyle w:val="ListBullet"/>
         <w:keepNext w:val="0"/>
-        <w:spacing w:before="0" w:after="60" w:line="271" w:lineRule="auto"/>
+        <w:spacing w:before="0" w:after="76" w:line="288" w:lineRule="auto"/>
         <w:ind w:left="518" w:hanging="259"/>
         <w:jc w:val="both"/>
       </w:pPr>
@@ -928,7 +938,7 @@
     <w:p>
       <w:pPr>
         <w:keepNext/>
-        <w:spacing w:before="140" w:after="120" w:line="240" w:lineRule="auto"/>
+        <w:spacing w:before="150" w:after="130" w:line="240" w:lineRule="auto"/>
         <w:pBdr>
           <w:bottom w:val="single" w:sz="6" w:space="4" w:color="D6DEE6"/>
         </w:pBdr>
@@ -948,8 +958,9 @@
     </w:p>
     <w:tbl>
       <w:tblPr>
-        <w:tblW w:type="dxa" w:w="9360"/>
+        <w:tblW w:type="dxa" w:w="9864"/>
         <w:jc w:val="left"/>
+        <w:tblLayout w:type="fixed"/>
         <w:tblLook w:firstColumn="1" w:firstRow="1" w:lastColumn="0" w:lastRow="0" w:noHBand="0" w:noVBand="1" w:val="04A0"/>
         <w:tblBorders>
           <w:top w:val="nil"/>
@@ -961,14 +972,14 @@
         </w:tblBorders>
       </w:tblPr>
       <w:tblGrid>
-        <w:gridCol w:w="3297"/>
-        <w:gridCol w:w="3297"/>
-        <w:gridCol w:w="3297"/>
+        <w:gridCol w:w="6552"/>
+        <w:gridCol w:w="2088"/>
+        <w:gridCol w:w="1224"/>
       </w:tblGrid>
       <w:tr>
         <w:tc>
           <w:tcPr>
-            <w:tcW w:type="dxa" w:w="5200"/>
+            <w:tcW w:type="dxa" w:w="6552"/>
             <w:tcMar>
               <w:top w:w="75" w:type="dxa"/>
               <w:start w:w="70" w:type="dxa"/>
@@ -980,7 +991,8 @@
           <w:p>
             <w:pPr>
               <w:keepNext w:val="0"/>
-              <w:spacing w:before="0" w:after="16" w:line="252" w:lineRule="auto"/>
+              <w:spacing w:before="0" w:after="44" w:line="269" w:lineRule="auto"/>
+              <w:jc w:val="left"/>
             </w:pPr>
             <w:r>
               <w:rPr>
@@ -996,19 +1008,19 @@
             <w:hyperlink r:id="rId16">
               <w:r>
                 <w:rPr>
-                  <w:rFonts w:ascii="Arial" w:hAnsi="Arial"/>
+                  <w:rFonts w:ascii="Arial" w:hAnsi="Arial" w:eastAsia="Arial" w:cs="Arial"/>
                   <w:sz w:val="21"/>
                   <w:color w:val="005BA0"/>
                   <w:u w:val="none"/>
                 </w:rPr>
-                <w:t>University of Economics Ho Chi Minh City (UEH)</w:t>
+                <w:t>University of Economics HCMC (UEH)</w:t>
               </w:r>
             </w:hyperlink>
           </w:p>
         </w:tc>
         <w:tc>
           <w:tcPr>
-            <w:tcW w:type="dxa" w:w="2050"/>
+            <w:tcW w:type="dxa" w:w="2088"/>
             <w:tcMar>
               <w:top w:w="75" w:type="dxa"/>
               <w:start w:w="70" w:type="dxa"/>
@@ -1020,7 +1032,7 @@
           <w:p>
             <w:pPr>
               <w:keepNext w:val="0"/>
-              <w:spacing w:before="0" w:after="16" w:line="252" w:lineRule="auto"/>
+              <w:spacing w:before="0" w:after="44" w:line="269" w:lineRule="auto"/>
               <w:jc w:val="right"/>
             </w:pPr>
             <w:r>
@@ -1038,7 +1050,7 @@
         </w:tc>
         <w:tc>
           <w:tcPr>
-            <w:tcW w:type="dxa" w:w="2110"/>
+            <w:tcW w:type="dxa" w:w="1224"/>
             <w:tcMar>
               <w:top w:w="75" w:type="dxa"/>
               <w:start w:w="70" w:type="dxa"/>
@@ -1050,7 +1062,7 @@
           <w:p>
             <w:pPr>
               <w:keepNext w:val="0"/>
-              <w:spacing w:before="0" w:after="16" w:line="252" w:lineRule="auto"/>
+              <w:spacing w:before="0" w:after="44" w:line="269" w:lineRule="auto"/>
               <w:jc w:val="right"/>
             </w:pPr>
             <w:r>
@@ -1062,7 +1074,7 @@
                 <w:sz w:val="17"/>
                 <w:u w:val="none"/>
               </w:rPr>
-              <w:t>Ho Chi Minh City, VN</w:t>
+              <w:t>HCMC, VN</w:t>
             </w:r>
           </w:p>
         </w:tc>
@@ -1072,10 +1084,21 @@
       <w:pPr>
         <w:pStyle w:val="ListBullet"/>
         <w:keepNext w:val="0"/>
-        <w:spacing w:before="0" w:after="60" w:line="271" w:lineRule="auto"/>
+        <w:spacing w:before="0" w:after="76" w:line="288" w:lineRule="auto"/>
         <w:ind w:left="518" w:hanging="259"/>
         <w:jc w:val="left"/>
       </w:pPr>
+      <w:r>
+        <w:rPr>
+          <w:rFonts w:ascii="Arial" w:hAnsi="Arial" w:eastAsia="Arial"/>
+          <w:b w:val="1"/>
+          <w:i w:val="0"/>
+          <w:color w:val="143D59"/>
+          <w:sz w:val="18"/>
+          <w:u w:val="none"/>
+        </w:rPr>
+        <w:t>GPA: 3.9 / 4.0</w:t>
+      </w:r>
       <w:r>
         <w:rPr>
           <w:rFonts w:ascii="Arial" w:hAnsi="Arial" w:eastAsia="Arial"/>
@@ -1085,14 +1108,25 @@
           <w:sz w:val="18"/>
           <w:u w:val="none"/>
         </w:rPr>
-        <w:t>GPA: 3.9 / 4.0; 2x Excellence Scholarship recipient.</w:t>
+        <w:t xml:space="preserve"> | </w:t>
+      </w:r>
+      <w:r>
+        <w:rPr>
+          <w:rFonts w:ascii="Arial" w:hAnsi="Arial" w:eastAsia="Arial"/>
+          <w:b w:val="1"/>
+          <w:i w:val="0"/>
+          <w:color w:val="143D59"/>
+          <w:sz w:val="18"/>
+          <w:u w:val="none"/>
+        </w:rPr>
+        <w:t>2x Excellence Scholarship recipient.</w:t>
       </w:r>
     </w:p>
     <w:p>
       <w:pPr>
         <w:pStyle w:val="ListBullet"/>
         <w:keepNext w:val="0"/>
-        <w:spacing w:before="0" w:after="60" w:line="271" w:lineRule="auto"/>
+        <w:spacing w:before="0" w:after="76" w:line="288" w:lineRule="auto"/>
         <w:ind w:left="518" w:hanging="259"/>
         <w:jc w:val="left"/>
       </w:pPr>
@@ -1111,7 +1145,7 @@
     <w:p>
       <w:pPr>
         <w:keepNext/>
-        <w:spacing w:before="140" w:after="120" w:line="240" w:lineRule="auto"/>
+        <w:spacing w:before="150" w:after="130" w:line="240" w:lineRule="auto"/>
         <w:pBdr>
           <w:bottom w:val="single" w:sz="6" w:space="4" w:color="D6DEE6"/>
         </w:pBdr>
@@ -1163,19 +1197,17 @@
           <w:p>
             <w:pPr>
               <w:keepNext w:val="0"/>
-              <w:spacing w:before="0" w:after="40" w:line="264" w:lineRule="auto"/>
+              <w:spacing w:before="0" w:after="44" w:line="269" w:lineRule="auto"/>
               <w:jc w:val="left"/>
             </w:pPr>
             <w:r>
               <w:rPr>
-                <w:rFonts w:ascii="Arial" w:hAnsi="Arial" w:eastAsia="Arial"/>
+                <w:rFonts w:ascii="Arial" w:hAnsi="Arial" w:eastAsia="Arial" w:cs="Arial"/>
                 <w:b/>
-                <w:i w:val="0"/>
                 <w:color w:val="143D59"/>
                 <w:sz w:val="17"/>
-                <w:u w:val="none"/>
               </w:rPr>
-              <w:t>Finance</w:t>
+              <w:t>FP&amp;A</w:t>
             </w:r>
           </w:p>
         </w:tc>
@@ -1194,19 +1226,17 @@
           <w:p>
             <w:pPr>
               <w:keepNext w:val="0"/>
-              <w:spacing w:before="0" w:after="40" w:line="264" w:lineRule="auto"/>
+              <w:spacing w:before="0" w:after="44" w:line="269" w:lineRule="auto"/>
               <w:jc w:val="left"/>
             </w:pPr>
             <w:r>
               <w:rPr>
-                <w:rFonts w:ascii="Arial" w:hAnsi="Arial" w:eastAsia="Arial"/>
+                <w:rFonts w:ascii="Arial" w:hAnsi="Arial" w:eastAsia="Arial" w:cs="Arial"/>
                 <w:b w:val="0"/>
-                <w:i w:val="0"/>
                 <w:color w:val="24272A"/>
                 <w:sz w:val="17"/>
-                <w:u w:val="none"/>
               </w:rPr>
-              <w:t>FP&amp;A, Budgeting &amp; Forecasting, Variance Analysis, Multi-entity Consolidation, Management Reporting, KPI Design, Internal Audit, AR/AP, Working Capital, ACCA F3/F6 (self-studied)</w:t>
+              <w:t>Budgeting &amp; Forecasting, Management Reporting, Variance Analysis, P&amp;L &amp; Profitability Analysis, KPI Tracking</w:t>
             </w:r>
           </w:p>
         </w:tc>
@@ -1227,19 +1257,17 @@
           <w:p>
             <w:pPr>
               <w:keepNext w:val="0"/>
-              <w:spacing w:before="0" w:after="40" w:line="264" w:lineRule="auto"/>
+              <w:spacing w:before="0" w:after="44" w:line="269" w:lineRule="auto"/>
               <w:jc w:val="left"/>
             </w:pPr>
             <w:r>
               <w:rPr>
-                <w:rFonts w:ascii="Arial" w:hAnsi="Arial" w:eastAsia="Arial"/>
+                <w:rFonts w:ascii="Arial" w:hAnsi="Arial" w:eastAsia="Arial" w:cs="Arial"/>
                 <w:b/>
-                <w:i w:val="0"/>
                 <w:color w:val="143D59"/>
                 <w:sz w:val="17"/>
-                <w:u w:val="none"/>
               </w:rPr>
-              <w:t>Technical</w:t>
+              <w:t>BI &amp; Automation</w:t>
             </w:r>
           </w:p>
         </w:tc>
@@ -1257,19 +1285,17 @@
           </w:tcPr>
           <w:p>
             <w:pPr>
-              <w:spacing w:line="264" w:lineRule="auto" w:after="40"/>
+              <w:spacing w:line="269" w:lineRule="auto" w:after="44"/>
               <w:jc w:val="left"/>
             </w:pPr>
             <w:r>
               <w:rPr>
-                <w:rFonts w:ascii="Arial" w:hAnsi="Arial" w:eastAsia="Arial"/>
+                <w:rFonts w:ascii="Arial" w:hAnsi="Arial" w:eastAsia="Arial" w:cs="Arial"/>
                 <w:b w:val="0"/>
-                <w:i w:val="0"/>
                 <w:color w:val="24272A"/>
                 <w:sz w:val="17"/>
-                <w:u w:val="none"/>
               </w:rPr>
-              <w:t>Python (pandas/openpyxl workflow automation), SQL, Power BI, DAX, Power Query, Excel (advanced), CubeValue, Agentic AI workflow design, AI-assisted automation, ERP S21, SAP Concur, Cargowise, GitHub / VS Code</w:t>
+              <w:t>Excel (advanced), Power BI, Power Query, DAX, Python (pandas, openpyxl), SQL, CubeValue</w:t>
             </w:r>
           </w:p>
         </w:tc>
@@ -1290,19 +1316,17 @@
           <w:p>
             <w:pPr>
               <w:keepNext w:val="0"/>
-              <w:spacing w:before="0" w:after="40" w:line="264" w:lineRule="auto"/>
+              <w:spacing w:before="0" w:after="44" w:line="269" w:lineRule="auto"/>
               <w:jc w:val="left"/>
             </w:pPr>
             <w:r>
               <w:rPr>
-                <w:rFonts w:ascii="Arial" w:hAnsi="Arial" w:eastAsia="Arial"/>
+                <w:rFonts w:ascii="Arial" w:hAnsi="Arial" w:eastAsia="Arial" w:cs="Arial"/>
                 <w:b/>
-                <w:i w:val="0"/>
                 <w:color w:val="143D59"/>
                 <w:sz w:val="17"/>
-                <w:u w:val="none"/>
               </w:rPr>
-              <w:t>Languages</w:t>
+              <w:t>Agentic AI</w:t>
             </w:r>
           </w:p>
         </w:tc>
@@ -1320,19 +1344,17 @@
           </w:tcPr>
           <w:p>
             <w:pPr>
-              <w:spacing w:line="264" w:lineRule="auto" w:after="40"/>
+              <w:spacing w:line="269" w:lineRule="auto" w:after="44"/>
               <w:jc w:val="left"/>
             </w:pPr>
             <w:r>
               <w:rPr>
-                <w:rFonts w:ascii="Arial" w:hAnsi="Arial" w:eastAsia="Arial"/>
+                <w:rFonts w:ascii="Arial" w:hAnsi="Arial" w:eastAsia="Arial" w:cs="Arial"/>
                 <w:b w:val="0"/>
-                <w:i w:val="0"/>
                 <w:color w:val="24272A"/>
                 <w:sz w:val="17"/>
-                <w:u w:val="none"/>
               </w:rPr>
-              <w:t>Vietnamese, Native | English, Professional (IELTS 6.5)</w:t>
+              <w:t>Workflow automation, human-in-the-loop controls, multi-agent delegation, reusable agent skills, context management, MCP, RAG, HTML slide creation</w:t>
             </w:r>
           </w:p>
         </w:tc>
@@ -1353,19 +1375,17 @@
           <w:p>
             <w:pPr>
               <w:keepNext w:val="0"/>
-              <w:spacing w:before="0" w:after="40" w:line="264" w:lineRule="auto"/>
+              <w:spacing w:before="0" w:after="44" w:line="269" w:lineRule="auto"/>
               <w:jc w:val="left"/>
             </w:pPr>
             <w:r>
               <w:rPr>
-                <w:rFonts w:ascii="Arial" w:hAnsi="Arial" w:eastAsia="Arial"/>
+                <w:rFonts w:ascii="Arial" w:hAnsi="Arial" w:eastAsia="Arial" w:cs="Arial"/>
                 <w:b/>
-                <w:i w:val="0"/>
                 <w:color w:val="143D59"/>
                 <w:sz w:val="17"/>
-                <w:u w:val="none"/>
               </w:rPr>
-              <w:t>Soft Skills</w:t>
+              <w:t>AI Platforms</w:t>
             </w:r>
           </w:p>
         </w:tc>
@@ -1384,19 +1404,137 @@
           <w:p>
             <w:pPr>
               <w:keepNext w:val="0"/>
-              <w:spacing w:before="0" w:after="40" w:line="264" w:lineRule="auto"/>
+              <w:spacing w:before="0" w:after="44" w:line="269" w:lineRule="auto"/>
               <w:jc w:val="left"/>
             </w:pPr>
             <w:r>
               <w:rPr>
-                <w:rFonts w:ascii="Arial" w:hAnsi="Arial" w:eastAsia="Arial"/>
+                <w:rFonts w:ascii="Arial" w:hAnsi="Arial" w:eastAsia="Arial" w:cs="Arial"/>
                 <w:b w:val="0"/>
-                <w:i w:val="0"/>
                 <w:color w:val="24272A"/>
                 <w:sz w:val="17"/>
-                <w:u w:val="none"/>
               </w:rPr>
-              <w:t>Stakeholder management, Cross-functional collaboration, Structured problem-solving, Data storytelling, Adaptability in MNC environments</w:t>
+              <w:t>ChatGPT, Codex, Claude, GitHub Copilot Pro</w:t>
+            </w:r>
+          </w:p>
+        </w:tc>
+      </w:tr>
+      <w:tr>
+        <w:tc>
+          <w:tcPr>
+            <w:tcW w:type="dxa" w:w="1500"/>
+            <w:tcMar>
+              <w:top w:w="75" w:type="dxa"/>
+              <w:start w:w="70" w:type="dxa"/>
+              <w:bottom w:w="75" w:type="dxa"/>
+              <w:end w:w="70" w:type="dxa"/>
+            </w:tcMar>
+            <w:vAlign w:val="center"/>
+            <w:shd w:fill="FFFFFF"/>
+          </w:tcPr>
+          <w:p>
+            <w:pPr>
+              <w:keepNext w:val="0"/>
+              <w:spacing w:before="0" w:after="44" w:line="269" w:lineRule="auto"/>
+              <w:jc w:val="left"/>
+            </w:pPr>
+            <w:r>
+              <w:rPr>
+                <w:rFonts w:ascii="Arial" w:hAnsi="Arial" w:eastAsia="Arial" w:cs="Arial"/>
+                <w:b/>
+                <w:color w:val="143D59"/>
+                <w:sz w:val="17"/>
+              </w:rPr>
+              <w:t>Systems</w:t>
+            </w:r>
+          </w:p>
+        </w:tc>
+        <w:tc>
+          <w:tcPr>
+            <w:tcW w:type="dxa" w:w="7860"/>
+            <w:tcMar>
+              <w:top w:w="75" w:type="dxa"/>
+              <w:start w:w="70" w:type="dxa"/>
+              <w:bottom w:w="75" w:type="dxa"/>
+              <w:end w:w="70" w:type="dxa"/>
+            </w:tcMar>
+            <w:vAlign w:val="center"/>
+            <w:shd w:fill="FFFFFF"/>
+          </w:tcPr>
+          <w:p>
+            <w:pPr>
+              <w:keepNext w:val="0"/>
+              <w:spacing w:before="0" w:after="44" w:line="269" w:lineRule="auto"/>
+              <w:jc w:val="left"/>
+            </w:pPr>
+            <w:r>
+              <w:rPr>
+                <w:rFonts w:ascii="Arial" w:hAnsi="Arial" w:eastAsia="Arial" w:cs="Arial"/>
+                <w:b w:val="0"/>
+                <w:color w:val="24272A"/>
+                <w:sz w:val="17"/>
+              </w:rPr>
+              <w:t>CargoWise, ERP S21, SAP Concur, GitHub, VS Code</w:t>
+            </w:r>
+          </w:p>
+        </w:tc>
+      </w:tr>
+      <w:tr>
+        <w:tc>
+          <w:tcPr>
+            <w:tcW w:type="dxa" w:w="1500"/>
+            <w:tcMar>
+              <w:top w:w="75" w:type="dxa"/>
+              <w:start w:w="70" w:type="dxa"/>
+              <w:bottom w:w="75" w:type="dxa"/>
+              <w:end w:w="70" w:type="dxa"/>
+            </w:tcMar>
+            <w:vAlign w:val="center"/>
+            <w:shd w:fill="FFFFFF"/>
+          </w:tcPr>
+          <w:p>
+            <w:pPr>
+              <w:keepNext w:val="0"/>
+              <w:spacing w:before="0" w:after="44" w:line="269" w:lineRule="auto"/>
+              <w:jc w:val="left"/>
+            </w:pPr>
+            <w:r>
+              <w:rPr>
+                <w:rFonts w:ascii="Arial" w:hAnsi="Arial" w:eastAsia="Arial" w:cs="Arial"/>
+                <w:b/>
+                <w:color w:val="143D59"/>
+                <w:sz w:val="17"/>
+              </w:rPr>
+              <w:t>Languages</w:t>
+            </w:r>
+          </w:p>
+        </w:tc>
+        <w:tc>
+          <w:tcPr>
+            <w:tcW w:type="dxa" w:w="7860"/>
+            <w:tcMar>
+              <w:top w:w="75" w:type="dxa"/>
+              <w:start w:w="70" w:type="dxa"/>
+              <w:bottom w:w="75" w:type="dxa"/>
+              <w:end w:w="70" w:type="dxa"/>
+            </w:tcMar>
+            <w:vAlign w:val="center"/>
+            <w:shd w:fill="FFFFFF"/>
+          </w:tcPr>
+          <w:p>
+            <w:pPr>
+              <w:keepNext w:val="0"/>
+              <w:spacing w:before="0" w:after="44" w:line="269" w:lineRule="auto"/>
+              <w:jc w:val="left"/>
+            </w:pPr>
+            <w:r>
+              <w:rPr>
+                <w:rFonts w:ascii="Arial" w:hAnsi="Arial" w:eastAsia="Arial" w:cs="Arial"/>
+                <w:b w:val="0"/>
+                <w:color w:val="24272A"/>
+                <w:sz w:val="17"/>
+              </w:rPr>
+              <w:t>Vietnamese (Native) | English (IELTS 6.5)</w:t>
             </w:r>
           </w:p>
         </w:tc>
@@ -1405,7 +1543,7 @@
     <w:p>
       <w:pPr>
         <w:keepNext/>
-        <w:spacing w:before="140" w:after="120" w:line="240" w:lineRule="auto"/>
+        <w:spacing w:before="150" w:after="130" w:line="240" w:lineRule="auto"/>
         <w:jc w:val="left"/>
         <w:pBdr>
           <w:bottom w:val="single" w:sz="6" w:space="4" w:color="D6DEE6"/>
@@ -1426,14 +1564,14 @@
     <w:p>
       <w:pPr>
         <w:pStyle w:val="ListBullet"/>
-        <w:spacing w:after="60" w:line="271" w:lineRule="auto"/>
+        <w:spacing w:after="76" w:line="288" w:lineRule="auto"/>
         <w:ind w:left="518" w:hanging="259"/>
         <w:jc w:val="left"/>
       </w:pPr>
       <w:hyperlink r:id="rId13">
         <w:r>
           <w:rPr>
-            <w:rFonts w:ascii="Arial" w:hAnsi="Arial" w:eastAsia="Arial"/>
+            <w:rFonts w:ascii="Arial" w:hAnsi="Arial" w:eastAsia="Arial" w:cs="Arial"/>
             <w:color w:val="1F5F8B"/>
             <w:sz w:val="18"/>
             <w:szCs w:val="18"/>
@@ -1452,32 +1590,111 @@
           <w:sz w:val="18"/>
           <w:u w:val="none"/>
         </w:rPr>
-        <w:t>: public-safe FP&amp;A/analytics showcase with Power BI products, Python automation samples, sanitized decision cases, and model QA notes.</w:t>
+        <w:t>: Public-safe FP&amp;A/analytics showcase with Power BI products, Python automation samples, sanitized decision cases, and model QA notes.</w:t>
       </w:r>
     </w:p>
     <w:p>
       <w:pPr>
         <w:pStyle w:val="ListBullet"/>
-        <w:spacing w:after="60" w:line="271" w:lineRule="auto"/>
+        <w:spacing w:after="76" w:line="288" w:lineRule="auto"/>
         <w:ind w:left="518" w:hanging="259"/>
         <w:jc w:val="left"/>
       </w:pPr>
+      <w:hyperlink r:id="rId18">
+        <w:r>
+          <w:rPr>
+            <w:rFonts w:ascii="Arial" w:hAnsi="Arial" w:eastAsia="Arial" w:cs="Arial"/>
+            <w:color w:val="1F5F8B"/>
+            <w:sz w:val="18"/>
+            <w:szCs w:val="18"/>
+            <w:b/>
+            <w:u w:val="none"/>
+          </w:rPr>
+          <w:t>GitHub</w:t>
+        </w:r>
+      </w:hyperlink>
       <w:r>
         <w:rPr>
           <w:rFonts w:ascii="Arial" w:hAnsi="Arial" w:eastAsia="Arial"/>
           <w:b w:val="0"/>
-          <w:i w:val="0"/>
           <w:color w:val="24272A"/>
           <w:sz w:val="18"/>
           <w:u w:val="none"/>
         </w:rPr>
-        <w:t>Curated 20-project BI portfolio: Monthly FP&amp;A Performance Pack, Driver-Based Forecasting, executive decision cases, Python monthly reporting/KPI distribution, plus planned briefs for regional FP&amp;A, treasury, SaaS, payments, risk, governance, and board reporting.</w:t>
+        <w:t>: 20-project BI portfolio, being completed progressively: Monthly FP&amp;A Performance Pack, Driver-Based Forecasting, executive decision cases, Python monthly reporting/KPI distribution, plus planned briefs for regional FP&amp;A, treasury, SaaS, payments, risk, governance, and board reporting.</w:t>
       </w:r>
     </w:p>
     <w:p>
       <w:pPr>
+        <w:pStyle w:val="ListBullet"/>
+        <w:spacing w:after="76" w:line="288" w:lineRule="auto"/>
+        <w:ind w:left="518" w:hanging="259"/>
+        <w:jc w:val="left"/>
+      </w:pPr>
+      <w:hyperlink r:id="rId21" w:history="1">
+        <w:r>
+          <w:rPr>
+            <w:rFonts w:ascii="Arial" w:hAnsi="Arial" w:eastAsia="Arial" w:cs="Arial"/>
+            <w:color w:val="1F5F8B"/>
+            <w:sz w:val="18"/>
+            <w:szCs w:val="18"/>
+            <w:b/>
+            <w:u w:val="none"/>
+          </w:rPr>
+          <w:t>Predictive Collections Agent (AABW 2026):</w:t>
+        </w:r>
+      </w:hyperlink>
+      <w:r>
+        <w:rPr>
+          <w:rFonts w:ascii="Arial" w:hAnsi="Arial" w:eastAsia="Arial"/>
+          <w:b w:val="0"/>
+          <w:color w:val="24272A"/>
+          <w:sz w:val="18"/>
+          <w:u w:val="none"/>
+        </w:rPr>
+        <w:t xml:space="preserve"> Designed a mock-data, 7-14-day early-warning and next-best-action workflow with explainable recommendations, human approval gates, an illustrative finance case, and controlled-pilot KPIs; delivered a six-slide HTML pitch deck and focused demo. </w:t>
+      </w:r>
+      <w:hyperlink r:id="rId19" w:history="1">
+        <w:r>
+          <w:rPr>
+            <w:rFonts w:ascii="Arial" w:hAnsi="Arial" w:eastAsia="Arial" w:cs="Arial"/>
+            <w:color w:val="1F5F8B"/>
+            <w:sz w:val="18"/>
+            <w:szCs w:val="18"/>
+            <w:b/>
+            <w:u w:val="none"/>
+          </w:rPr>
+          <w:t>Pitch Deck</w:t>
+        </w:r>
+      </w:hyperlink>
+      <w:r>
+        <w:rPr>
+          <w:rFonts w:ascii="Arial" w:hAnsi="Arial" w:eastAsia="Arial"/>
+          <w:b w:val="0"/>
+          <w:color w:val="24272A"/>
+          <w:sz w:val="18"/>
+          <w:u w:val="none"/>
+        </w:rPr>
+        <w:t xml:space="preserve"> | </w:t>
+      </w:r>
+      <w:hyperlink r:id="rId20" w:history="1">
+        <w:r>
+          <w:rPr>
+            <w:rFonts w:ascii="Arial" w:hAnsi="Arial" w:eastAsia="Arial" w:cs="Arial"/>
+            <w:color w:val="1F5F8B"/>
+            <w:sz w:val="18"/>
+            <w:szCs w:val="18"/>
+            <w:b/>
+            <w:u w:val="none"/>
+          </w:rPr>
+          <w:t>AABW 2026 Recap</w:t>
+        </w:r>
+      </w:hyperlink>
+    </w:p>
+    <w:p>
+      <w:pPr>
         <w:keepNext/>
-        <w:spacing w:before="140" w:after="120" w:line="240" w:lineRule="auto"/>
+        <w:spacing w:before="150" w:after="130" w:line="240" w:lineRule="auto"/>
         <w:pBdr>
           <w:bottom w:val="single" w:sz="6" w:space="4" w:color="D6DEE6"/>
         </w:pBdr>
@@ -1499,17 +1716,18 @@
       <w:pPr>
         <w:pStyle w:val="ListBullet"/>
         <w:keepNext w:val="0"/>
-        <w:spacing w:before="0" w:after="60" w:line="271" w:lineRule="auto"/>
+        <w:spacing w:before="0" w:after="76" w:line="288" w:lineRule="auto"/>
         <w:ind w:left="518" w:hanging="259"/>
         <w:jc w:val="left"/>
       </w:pPr>
       <w:hyperlink r:id="rId17">
         <w:r>
           <w:rPr>
-            <w:rFonts w:ascii="Arial" w:hAnsi="Arial"/>
+            <w:rFonts w:ascii="Arial" w:hAnsi="Arial" w:eastAsia="Arial" w:cs="Arial"/>
             <w:sz w:val="18"/>
             <w:color w:val="1F5F8B"/>
             <w:u w:val="none"/>
+            <w:b w:val="1"/>
           </w:rPr>
           <w:t>Agentic AI Build Week 2026 - GenAI Fund</w:t>
         </w:r>
@@ -1523,14 +1741,33 @@
           <w:sz w:val="18"/>
           <w:u w:val="none"/>
         </w:rPr>
-        <w:t xml:space="preserve"> | Builder, upcoming Jul 2026: joining a 5-day on-site buildathon to prototype an agentic AI solution from released enterprise problem statements.</w:t>
+        <w:t xml:space="preserve"> | Product &amp; Finance Contributor, 8-12 Jul 2026: completed a 5-day on-site buildathon in Ho Chi Minh City, contributing problem framing, workflow design, product storytelling, and demo delivery.</w:t>
+      </w:r>
+    </w:p>
+    <w:p>
+      <w:pPr>
+        <w:pStyle w:val="ListBullet"/>
+        <w:spacing w:line="288" w:lineRule="auto" w:after="76"/>
+        <w:ind w:left="518" w:hanging="259"/>
+        <w:jc w:val="left"/>
+      </w:pPr>
+      <w:r>
+        <w:rPr>
+          <w:rFonts w:ascii="Arial" w:hAnsi="Arial" w:eastAsia="Arial"/>
+          <w:b w:val="0"/>
+          <w:i w:val="0"/>
+          <w:color w:val="24272A"/>
+          <w:sz w:val="18"/>
+          <w:u w:val="none"/>
+        </w:rPr>
+        <w:t>Claude AI Training for Finance &amp; Accounting Teams | Internal trainer: trained finance/accounting users across 14 BUs on applying Claude AI to daily work, including prompt structure, Excel/reporting use cases, review controls, and safe adoption habits.</w:t>
       </w:r>
     </w:p>
     <w:p>
       <w:pPr>
         <w:pStyle w:val="ListBullet"/>
         <w:keepNext w:val="0"/>
-        <w:spacing w:before="0" w:after="60" w:line="271" w:lineRule="auto"/>
+        <w:spacing w:before="0" w:after="76" w:line="288" w:lineRule="auto"/>
         <w:ind w:left="518" w:hanging="259"/>
         <w:jc w:val="left"/>
       </w:pPr>

</xml_diff>

<commit_message>
Update CV with automation and team-scale app skills
</commit_message>
<xml_diff>
--- a/assets/Truong-Dinh-Anh-Tu-CV-2026.docx
+++ b/assets/Truong-Dinh-Anh-Tu-CV-2026.docx
@@ -191,7 +191,7 @@
           <w:sz w:val="18"/>
           <w:u w:val="none"/>
         </w:rPr>
-        <w:t>FP&amp;A analyst with hands-on experience in budgeting, management reporting, KPI governance, commercial analysis, audit support, and BI/Python automation across finance operations. I build controlled reporting pipelines, dashboard-ready datasets, variance insights, and agent-assisted review logic, with exposure to English-speaking MNC workflows and multi-entity finance reporting.</w:t>
+        <w:t>FP&amp;A analyst with hands-on experience in budgeting, management reporting, KPI governance, commercial analysis, audit support, and BI/Python automation across finance operations. I build controlled reporting pipelines, dashboard-ready datasets, variance insights, and reusable team workspaces and agent-assisted review logic for recurring finance tasks, with exposure to English-speaking MNC workflows and multi-entity finance reporting.</w:t>
       </w:r>
     </w:p>
     <w:p>
@@ -1326,6 +1326,65 @@
                 <w:color w:val="143D59"/>
                 <w:sz w:val="17"/>
               </w:rPr>
+              <w:t>App Development</w:t>
+            </w:r>
+          </w:p>
+        </w:tc>
+        <w:tc>
+          <w:tcPr>
+            <w:tcW w:type="dxa" w:w="7860"/>
+            <w:tcMar>
+              <w:top w:w="75" w:type="dxa"/>
+              <w:start w:w="70" w:type="dxa"/>
+              <w:bottom w:w="75" w:type="dxa"/>
+              <w:end w:w="70" w:type="dxa"/>
+            </w:tcMar>
+            <w:vAlign w:val="center"/>
+            <w:shd w:fill="FFFFFF"/>
+          </w:tcPr>
+          <w:p>
+            <w:pPr>
+              <w:spacing w:line="269" w:lineRule="auto" w:after="44"/>
+              <w:jc w:val="left"/>
+            </w:pPr>
+            <w:r>
+              <w:rPr>
+                <w:rFonts w:ascii="Arial" w:hAnsi="Arial" w:eastAsia="Arial" w:cs="Arial"/>
+                <w:b w:val="0"/>
+                <w:color w:val="24272A"/>
+                <w:sz w:val="17"/>
+              </w:rPr>
+              <w:t>Can build team-scale full-stack tools: frontend, backend, databases, APIs, and UI/UX design</w:t>
+            </w:r>
+          </w:p>
+        </w:tc>
+      </w:tr>
+      <w:tr>
+        <w:tc>
+          <w:tcPr>
+            <w:tcW w:type="dxa" w:w="1500"/>
+            <w:tcMar>
+              <w:top w:w="75" w:type="dxa"/>
+              <w:start w:w="70" w:type="dxa"/>
+              <w:bottom w:w="75" w:type="dxa"/>
+              <w:end w:w="70" w:type="dxa"/>
+            </w:tcMar>
+            <w:vAlign w:val="center"/>
+            <w:shd w:fill="FFFFFF"/>
+          </w:tcPr>
+          <w:p>
+            <w:pPr>
+              <w:keepNext w:val="0"/>
+              <w:spacing w:before="0" w:after="44" w:line="269" w:lineRule="auto"/>
+              <w:jc w:val="left"/>
+            </w:pPr>
+            <w:r>
+              <w:rPr>
+                <w:rFonts w:ascii="Arial" w:hAnsi="Arial" w:eastAsia="Arial" w:cs="Arial"/>
+                <w:b/>
+                <w:color w:val="143D59"/>
+                <w:sz w:val="17"/>
+              </w:rPr>
               <w:t>Agentic AI</w:t>
             </w:r>
           </w:p>
@@ -1354,7 +1413,7 @@
                 <w:color w:val="24272A"/>
                 <w:sz w:val="17"/>
               </w:rPr>
-              <w:t>Workflow automation, human-in-the-loop controls, multi-agent delegation, reusable agent skills, context management, MCP, RAG, HTML slide creation</w:t>
+              <w:t>Team workspace design, recurring-task automation, human-in-the-loop controls, multi-agent delegation, reusable agent skills, context management, MCP, RAG</w:t>
             </w:r>
           </w:p>
         </w:tc>
@@ -1600,6 +1659,38 @@
         <w:ind w:left="518" w:hanging="259"/>
         <w:jc w:val="left"/>
       </w:pPr>
+      <w:hyperlink r:id="rId22" w:history="1">
+        <w:r>
+          <w:rPr>
+            <w:rFonts w:ascii="Arial" w:hAnsi="Arial" w:eastAsia="Arial" w:cs="Arial"/>
+            <w:color w:val="1F5F8B"/>
+            <w:sz w:val="18"/>
+            <w:szCs w:val="18"/>
+            <w:b/>
+            <w:u w:val="none"/>
+          </w:rPr>
+          <w:t>Recurring Task Automation:</w:t>
+        </w:r>
+      </w:hyperlink>
+      <w:r>
+        <w:rPr>
+          <w:rFonts w:ascii="Arial" w:hAnsi="Arial" w:eastAsia="Arial"/>
+          <w:b w:val="0"/>
+          <w:i w:val="0"/>
+          <w:color w:val="24272A"/>
+          <w:sz w:val="18"/>
+          <w:u w:val="none"/>
+        </w:rPr>
+        <w:t xml:space="preserve"> Builds practical team workspaces that automate repetitive manual tasks, organize shared information, and guide each step so teams can work faster, follow consistent processes, and review results before completion.</w:t>
+      </w:r>
+    </w:p>
+    <w:p>
+      <w:pPr>
+        <w:pStyle w:val="ListBullet"/>
+        <w:spacing w:after="76" w:line="288" w:lineRule="auto"/>
+        <w:ind w:left="518" w:hanging="259"/>
+        <w:jc w:val="left"/>
+      </w:pPr>
       <w:hyperlink r:id="rId18">
         <w:r>
           <w:rPr>
@@ -1610,7 +1701,7 @@
             <w:b/>
             <w:u w:val="none"/>
           </w:rPr>
-          <w:t>GitHub</w:t>
+          <w:t>BI Dashboard</w:t>
         </w:r>
       </w:hyperlink>
       <w:r>

</xml_diff>